<commit_message>
local project moved to new dir
</commit_message>
<xml_diff>
--- a/reports/FTTP_TC_Acq/FTTP_TC_Acq.docx
+++ b/reports/FTTP_TC_Acq/FTTP_TC_Acq.docx
@@ -20,7 +20,7 @@
     </w:p>
     <w:p>
       <w:r>
-        <w:t>Timestamp: 2026-06-12 19:52:49</w:t>
+        <w:t>Timestamp: 2026-06-13 15:00:48</w:t>
       </w:r>
     </w:p>
     <w:p>
@@ -36,7 +36,7 @@
               <a:graphicData uri="http://schemas.openxmlformats.org/drawingml/2006/picture">
                 <pic:pic>
                   <pic:nvPicPr>
-                    <pic:cNvPr id="0" name="01_Landing_Page_2026-06-12_19-52-49.png"/>
+                    <pic:cNvPr id="0" name="01_Landing_Page_2026-06-13_15-00-48.png"/>
                     <pic:cNvPicPr/>
                   </pic:nvPicPr>
                   <pic:blipFill>
@@ -69,7 +69,7 @@
     </w:p>
     <w:p>
       <w:r>
-        <w:t>Timestamp: 2026-06-12 19:52:59</w:t>
+        <w:t>Timestamp: 2026-06-13 15:01:02</w:t>
       </w:r>
     </w:p>
     <w:p>
@@ -85,7 +85,7 @@
               <a:graphicData uri="http://schemas.openxmlformats.org/drawingml/2006/picture">
                 <pic:pic>
                   <pic:nvPicPr>
-                    <pic:cNvPr id="0" name="02_Address_Page_2026-06-12_19-52-59.png"/>
+                    <pic:cNvPr id="0" name="02_Address_Page_2026-06-13_15-01-02.png"/>
                     <pic:cNvPicPr/>
                   </pic:nvPicPr>
                   <pic:blipFill>
@@ -118,14 +118,14 @@
     </w:p>
     <w:p>
       <w:r>
-        <w:t>Timestamp: 2026-06-12 19:53:08</w:t>
+        <w:t>Timestamp: 2026-06-13 15:01:13</w:t>
       </w:r>
     </w:p>
     <w:p>
       <w:r>
         <w:drawing>
           <wp:inline xmlns:a="http://schemas.openxmlformats.org/drawingml/2006/main" xmlns:pic="http://schemas.openxmlformats.org/drawingml/2006/picture">
-            <wp:extent cx="5029200" cy="12201277"/>
+            <wp:extent cx="5029200" cy="12209229"/>
             <wp:docPr id="3" name="Picture 3"/>
             <wp:cNvGraphicFramePr>
               <a:graphicFrameLocks noChangeAspect="1"/>
@@ -134,7 +134,7 @@
               <a:graphicData uri="http://schemas.openxmlformats.org/drawingml/2006/picture">
                 <pic:pic>
                   <pic:nvPicPr>
-                    <pic:cNvPr id="0" name="03_Plans_Page_2026-06-12_19-53-08.png"/>
+                    <pic:cNvPr id="0" name="03_Plans_Page_2026-06-13_15-01-13.png"/>
                     <pic:cNvPicPr/>
                   </pic:nvPicPr>
                   <pic:blipFill>
@@ -146,7 +146,7 @@
                   <pic:spPr>
                     <a:xfrm>
                       <a:off x="0" y="0"/>
-                      <a:ext cx="5029200" cy="12201277"/>
+                      <a:ext cx="5029200" cy="12209229"/>
                     </a:xfrm>
                     <a:prstGeom prst="rect"/>
                   </pic:spPr>
@@ -167,14 +167,14 @@
     </w:p>
     <w:p>
       <w:r>
-        <w:t>Timestamp: 2026-06-12 19:53:09</w:t>
+        <w:t>Timestamp: 2026-06-13 15:01:13</w:t>
       </w:r>
     </w:p>
     <w:p>
       <w:r>
         <w:drawing>
           <wp:inline xmlns:a="http://schemas.openxmlformats.org/drawingml/2006/main" xmlns:pic="http://schemas.openxmlformats.org/drawingml/2006/picture">
-            <wp:extent cx="5029200" cy="12201277"/>
+            <wp:extent cx="5029200" cy="12209229"/>
             <wp:docPr id="4" name="Picture 4"/>
             <wp:cNvGraphicFramePr>
               <a:graphicFrameLocks noChangeAspect="1"/>
@@ -183,7 +183,7 @@
               <a:graphicData uri="http://schemas.openxmlformats.org/drawingml/2006/picture">
                 <pic:pic>
                   <pic:nvPicPr>
-                    <pic:cNvPr id="0" name="04_Addons_Page_2026-06-12_19-53-09.png"/>
+                    <pic:cNvPr id="0" name="04_Addons_Page_2026-06-13_15-01-13.png"/>
                     <pic:cNvPicPr/>
                   </pic:nvPicPr>
                   <pic:blipFill>
@@ -195,7 +195,7 @@
                   <pic:spPr>
                     <a:xfrm>
                       <a:off x="0" y="0"/>
-                      <a:ext cx="5029200" cy="12201277"/>
+                      <a:ext cx="5029200" cy="12209229"/>
                     </a:xfrm>
                     <a:prstGeom prst="rect"/>
                   </pic:spPr>
@@ -216,7 +216,7 @@
     </w:p>
     <w:p>
       <w:r>
-        <w:t>Timestamp: 2026-06-12 19:53:32</w:t>
+        <w:t>Timestamp: 2026-06-13 15:01:24</w:t>
       </w:r>
     </w:p>
     <w:p>
@@ -232,7 +232,7 @@
               <a:graphicData uri="http://schemas.openxmlformats.org/drawingml/2006/picture">
                 <pic:pic>
                   <pic:nvPicPr>
-                    <pic:cNvPr id="0" name="05_Setup_Page_2026-06-12_19-53-32.png"/>
+                    <pic:cNvPr id="0" name="05_Setup_Page_2026-06-13_15-01-24.png"/>
                     <pic:cNvPicPr/>
                   </pic:nvPicPr>
                   <pic:blipFill>
@@ -265,14 +265,14 @@
     </w:p>
     <w:p>
       <w:r>
-        <w:t>Timestamp: 2026-06-12 19:53:45</w:t>
+        <w:t>Timestamp: 2026-06-13 15:01:35</w:t>
       </w:r>
     </w:p>
     <w:p>
       <w:r>
         <w:drawing>
           <wp:inline xmlns:a="http://schemas.openxmlformats.org/drawingml/2006/main" xmlns:pic="http://schemas.openxmlformats.org/drawingml/2006/picture">
-            <wp:extent cx="5029200" cy="11414098"/>
+            <wp:extent cx="5029200" cy="12070081"/>
             <wp:docPr id="6" name="Picture 6"/>
             <wp:cNvGraphicFramePr>
               <a:graphicFrameLocks noChangeAspect="1"/>
@@ -281,7 +281,7 @@
               <a:graphicData uri="http://schemas.openxmlformats.org/drawingml/2006/picture">
                 <pic:pic>
                   <pic:nvPicPr>
-                    <pic:cNvPr id="0" name="06_Basket_Page_2026-06-12_19-53-45.png"/>
+                    <pic:cNvPr id="0" name="06_Basket_Page_2026-06-13_15-01-35.png"/>
                     <pic:cNvPicPr/>
                   </pic:nvPicPr>
                   <pic:blipFill>
@@ -293,7 +293,7 @@
                   <pic:spPr>
                     <a:xfrm>
                       <a:off x="0" y="0"/>
-                      <a:ext cx="5029200" cy="11414098"/>
+                      <a:ext cx="5029200" cy="12070081"/>
                     </a:xfrm>
                     <a:prstGeom prst="rect"/>
                   </pic:spPr>
@@ -314,14 +314,14 @@
     </w:p>
     <w:p>
       <w:r>
-        <w:t>Timestamp: 2026-06-12 19:53:58</w:t>
+        <w:t>Timestamp: 2026-06-13 15:01:46</w:t>
       </w:r>
     </w:p>
     <w:p>
       <w:r>
         <w:drawing>
           <wp:inline xmlns:a="http://schemas.openxmlformats.org/drawingml/2006/main" xmlns:pic="http://schemas.openxmlformats.org/drawingml/2006/picture">
-            <wp:extent cx="5029200" cy="9120147"/>
+            <wp:extent cx="5029200" cy="9128098"/>
             <wp:docPr id="7" name="Picture 7"/>
             <wp:cNvGraphicFramePr>
               <a:graphicFrameLocks noChangeAspect="1"/>
@@ -330,7 +330,7 @@
               <a:graphicData uri="http://schemas.openxmlformats.org/drawingml/2006/picture">
                 <pic:pic>
                   <pic:nvPicPr>
-                    <pic:cNvPr id="0" name="07_Checkout_Page_Customer_Details_2026-06-12_19-53-58.png"/>
+                    <pic:cNvPr id="0" name="07_Checkout_Page_Customer_Details_2026-06-13_15-01-46.png"/>
                     <pic:cNvPicPr/>
                   </pic:nvPicPr>
                   <pic:blipFill>
@@ -342,7 +342,7 @@
                   <pic:spPr>
                     <a:xfrm>
                       <a:off x="0" y="0"/>
-                      <a:ext cx="5029200" cy="9120147"/>
+                      <a:ext cx="5029200" cy="9128098"/>
                     </a:xfrm>
                     <a:prstGeom prst="rect"/>
                   </pic:spPr>
@@ -363,7 +363,7 @@
     </w:p>
     <w:p>
       <w:r>
-        <w:t>Timestamp: 2026-06-12 19:54:02</w:t>
+        <w:t>Timestamp: 2026-06-13 15:01:48</w:t>
       </w:r>
     </w:p>
     <w:p>
@@ -379,7 +379,7 @@
               <a:graphicData uri="http://schemas.openxmlformats.org/drawingml/2006/picture">
                 <pic:pic>
                   <pic:nvPicPr>
-                    <pic:cNvPr id="0" name="08_Checkout_Page_Address_Details_2026-06-12_19-54-02.png"/>
+                    <pic:cNvPr id="0" name="08_Checkout_Page_Address_Details_2026-06-13_15-01-48.png"/>
                     <pic:cNvPicPr/>
                   </pic:nvPicPr>
                   <pic:blipFill>
@@ -412,14 +412,14 @@
     </w:p>
     <w:p>
       <w:r>
-        <w:t>Timestamp: 2026-06-12 19:54:05</w:t>
+        <w:t>Timestamp: 2026-06-13 15:01:50</w:t>
       </w:r>
     </w:p>
     <w:p>
       <w:r>
         <w:drawing>
           <wp:inline xmlns:a="http://schemas.openxmlformats.org/drawingml/2006/main" xmlns:pic="http://schemas.openxmlformats.org/drawingml/2006/picture">
-            <wp:extent cx="5029200" cy="9410369"/>
+            <wp:extent cx="5029200" cy="9380706"/>
             <wp:docPr id="9" name="Picture 9"/>
             <wp:cNvGraphicFramePr>
               <a:graphicFrameLocks noChangeAspect="1"/>
@@ -428,7 +428,7 @@
               <a:graphicData uri="http://schemas.openxmlformats.org/drawingml/2006/picture">
                 <pic:pic>
                   <pic:nvPicPr>
-                    <pic:cNvPr id="0" name="09_Checkout_Page_Delivery_Details_2026-06-12_19-54-05.png"/>
+                    <pic:cNvPr id="0" name="09_Checkout_Page_Delivery_Details_2026-06-13_15-01-50.png"/>
                     <pic:cNvPicPr/>
                   </pic:nvPicPr>
                   <pic:blipFill>
@@ -440,7 +440,7 @@
                   <pic:spPr>
                     <a:xfrm>
                       <a:off x="0" y="0"/>
-                      <a:ext cx="5029200" cy="9410369"/>
+                      <a:ext cx="5029200" cy="9380706"/>
                     </a:xfrm>
                     <a:prstGeom prst="rect"/>
                   </pic:spPr>
@@ -461,7 +461,7 @@
     </w:p>
     <w:p>
       <w:r>
-        <w:t>Timestamp: 2026-06-12 19:54:08</w:t>
+        <w:t>Timestamp: 2026-06-13 15:01:53</w:t>
       </w:r>
     </w:p>
     <w:p>
@@ -477,7 +477,7 @@
               <a:graphicData uri="http://schemas.openxmlformats.org/drawingml/2006/picture">
                 <pic:pic>
                   <pic:nvPicPr>
-                    <pic:cNvPr id="0" name="10_Checkout_Page_Bank_Details_2026-06-12_19-54-08.png"/>
+                    <pic:cNvPr id="0" name="10_Checkout_Page_Bank_Details_2026-06-13_15-01-53.png"/>
                     <pic:cNvPicPr/>
                   </pic:nvPicPr>
                   <pic:blipFill>

</xml_diff>